<commit_message>
STAGE 14: Implementation Audit and V3 Gap Fix Completion
</commit_message>
<xml_diff>
--- a/reports/seo-audit.docx
+++ b/reports/seo-audit.docx
@@ -55,7 +55,7 @@
         <w:rPr>
           <w:color w:val="111111"/>
         </w:rPr>
-        <w:t>2026-09-24 00:19:51</w:t>
+        <w:t>2026-09-24 23:27:38</w:t>
         <w:br/>
       </w:r>
       <w:r>
@@ -4682,10 +4682,22 @@
         <w:rPr>
           <w:b/>
         </w:rPr>
+        <w:t xml:space="preserve">• Template 'None': </w:t>
+      </w:r>
+      <w:r>
+        <w:t>Entity Conflict Title H1 (690 affected pages). Fix: Routine hygiene cleanup: review entity conflict title h1 on affected pages.</w:t>
+        <w:br/>
+      </w:r>
+    </w:p>
+    <w:p>
+      <w:r>
+        <w:rPr>
+          <w:b/>
+        </w:rPr>
         <w:t xml:space="preserve">• Template 'tpl_comparison_compare_2seg': </w:t>
       </w:r>
       <w:r>
-        <w:t>Template Page Has Noindex (6 affected pages). Fix: Routine hygiene cleanup: review template page has noindex on affected pages.</w:t>
+        <w:t>Template Page Has Noindex (16 affected pages). Fix: Routine hygiene cleanup: review template page has noindex on affected pages.</w:t>
         <w:br/>
       </w:r>
     </w:p>
@@ -4697,7 +4709,7 @@
         <w:t xml:space="preserve">• Template 'tpl_model_bikes_4seg': </w:t>
       </w:r>
       <w:r>
-        <w:t>Template Low Text To Html Ratio (6 affected pages). Fix: Routine hygiene cleanup: review template low text to html ratio on affected pages.</w:t>
+        <w:t>Template Low Text To Html Ratio (16 affected pages). Fix: Routine hygiene cleanup: review template low text to html ratio on affected pages.</w:t>
         <w:br/>
       </w:r>
     </w:p>
@@ -4706,10 +4718,10 @@
         <w:rPr>
           <w:b/>
         </w:rPr>
-        <w:t xml:space="preserve">• Template 'tpl_article_featured-stories_2seg': </w:t>
+        <w:t xml:space="preserve">• Template 'tpl_comparison_compare_2seg': </w:t>
       </w:r>
       <w:r>
-        <w:t>Uppercase In Url (4 affected pages). Fix: Routine hygiene cleanup: review uppercase in url on affected pages.</w:t>
+        <w:t>Template Template Page Has Noindex (10 affected pages). Fix: Routine hygiene cleanup: review template template page has noindex on affected pages.</w:t>
         <w:br/>
       </w:r>
     </w:p>
@@ -4721,7 +4733,7 @@
         <w:t xml:space="preserve">• Template 'tpl_article_news_2seg': </w:t>
       </w:r>
       <w:r>
-        <w:t>Template Slow Server Response (3 affected pages). Fix: Routine hygiene cleanup: review template slow server response on affected pages.</w:t>
+        <w:t>Template Slow Server Response (8 affected pages). Fix: Routine hygiene cleanup: review template slow server response on affected pages.</w:t>
         <w:br/>
       </w:r>
     </w:p>
@@ -4733,19 +4745,7 @@
         <w:t xml:space="preserve">• Template 'tpl_listing_ather-energy_2seg': </w:t>
       </w:r>
       <w:r>
-        <w:t>Template Empty H1 (3 affected pages). Fix: Routine hygiene cleanup: review template empty h1 on affected pages.</w:t>
-        <w:br/>
-      </w:r>
-    </w:p>
-    <w:p>
-      <w:r>
-        <w:rPr>
-          <w:b/>
-        </w:rPr>
-        <w:t xml:space="preserve">• Template 'tpl_listing_ather-energy_2seg': </w:t>
-      </w:r>
-      <w:r>
-        <w:t>Template Page Has Nofollow (3 affected pages). Fix: Routine hygiene cleanup: review template page has nofollow on affected pages.</w:t>
+        <w:t>Template Empty H1 (8 affected pages). Fix: Routine hygiene cleanup: review template empty h1 on affected pages.</w:t>
         <w:br/>
       </w:r>
     </w:p>
@@ -4901,7 +4901,19 @@
         <w:t xml:space="preserve">[P1] Orphan Page: </w:t>
       </w:r>
       <w:r>
-        <w:t>High-impact fix: update tpl_article_news_2seg layout to resolve orphan page across 4503 pages. (Location: Global layout / site-wide metadata service)</w:t>
+        <w:t>High-impact fix: update tpl_article_news_2seg layout to resolve orphan page across 12008 pages. (Location: Global layout / site-wide metadata service)</w:t>
+        <w:br/>
+      </w:r>
+    </w:p>
+    <w:p>
+      <w:r>
+        <w:rPr>
+          <w:b/>
+        </w:rPr>
+        <w:t xml:space="preserve">[P1] Weakly Linked Product Page: </w:t>
+      </w:r>
+      <w:r>
+        <w:t>High-impact fix: update tpl_model_bikes_3seg layout to resolve weakly linked product page across 1302 pages. (Location: Global layout / site-wide metadata service)</w:t>
         <w:br/>
       </w:r>
     </w:p>
@@ -4914,18 +4926,6 @@
       </w:r>
       <w:r>
         <w:t>High-impact fix: update tpl_brand_featured-stories_2seg layout to resolve canonical mismatch across 1146 pages. (Location: Global layout / site-wide metadata service)</w:t>
-        <w:br/>
-      </w:r>
-    </w:p>
-    <w:p>
-      <w:r>
-        <w:rPr>
-          <w:b/>
-        </w:rPr>
-        <w:t xml:space="preserve">[P1] Weakly Linked Product Page: </w:t>
-      </w:r>
-      <w:r>
-        <w:t>High-impact fix: update tpl_model_bikes_3seg layout to resolve weakly linked product page across 372 pages. (Location: Global layout / site-wide metadata service)</w:t>
         <w:br/>
       </w:r>
     </w:p>
@@ -5299,7 +5299,7 @@
     </w:p>
     <w:p>
       <w:r>
-        <w:t>Audit conducted on 2026-09-24 00:19:51 using SEOJEV V2. Crawler utilized async HTTP connection pooling with robots.txt compliance. Local Apple Silicon MLX inference executed model 'aac6fef/laya-mlx' for structured issue categorization. Laya performance: Median latency 57.75ms, P95 75.07ms.</w:t>
+        <w:t>Audit conducted on 2026-09-24 23:27:38 using SEOJEV V2. Crawler utilized async HTTP connection pooling with robots.txt compliance. Local Apple Silicon MLX inference executed model 'aac6fef/laya-mlx' for structured issue categorization. Laya performance: Median latency 287.46ms, P95 1189.35ms.</w:t>
       </w:r>
     </w:p>
     <w:p>
@@ -5343,7 +5343,7 @@
     </w:p>
     <w:p>
       <w:r>
-        <w:t>Total Pages Analyzed: 5,009 | Total Templates: 413 | Total Issue Clusters: 52 | Laya Decisions: 52.</w:t>
+        <w:t>Total Pages Analyzed: 5,009 | Total Templates: 413 | Total Issue Clusters: 89 | Laya Decisions: 89.</w:t>
       </w:r>
     </w:p>
     <w:sectPr>

</xml_diff>